<commit_message>
#77 - fixed broken sliders
</commit_message>
<xml_diff>
--- a/Documents/Hardscrabble Invoice.docx
+++ b/Documents/Hardscrabble Invoice.docx
@@ -1141,6 +1141,140 @@
           <w:szCs w:val="24"/>
         </w:rPr>
         <w:t>:</w:t>
+      </w:r>
+    </w:p>
+    <w:p>
+      <w:pPr>
+        <w:pStyle w:val="Normal"/>
+        <w:bidi w:val="0"/>
+        <w:jc w:val="start"/>
+        <w:rPr>
+          <w:b w:val="false"/>
+          <w:bCs w:val="false"/>
+          <w:sz w:val="24"/>
+          <w:szCs w:val="24"/>
+        </w:rPr>
+      </w:pPr>
+      <w:r>
+        <w:rPr>
+          <w:b w:val="false"/>
+          <w:bCs w:val="false"/>
+          <w:sz w:val="24"/>
+          <w:szCs w:val="24"/>
+        </w:rPr>
+      </w:r>
+    </w:p>
+    <w:p>
+      <w:pPr>
+        <w:pStyle w:val="Normal"/>
+        <w:bidi w:val="0"/>
+        <w:jc w:val="start"/>
+        <w:rPr>
+          <w:b w:val="false"/>
+          <w:bCs w:val="false"/>
+          <w:sz w:val="24"/>
+          <w:szCs w:val="24"/>
+        </w:rPr>
+      </w:pPr>
+      <w:r>
+        <w:rPr>
+          <w:b w:val="false"/>
+          <w:bCs w:val="false"/>
+          <w:sz w:val="24"/>
+          <w:szCs w:val="24"/>
+        </w:rPr>
+      </w:r>
+    </w:p>
+    <w:p>
+      <w:pPr>
+        <w:pStyle w:val="Normal"/>
+        <w:bidi w:val="0"/>
+        <w:jc w:val="start"/>
+        <w:rPr>
+          <w:b w:val="false"/>
+          <w:bCs w:val="false"/>
+          <w:sz w:val="24"/>
+          <w:szCs w:val="24"/>
+        </w:rPr>
+      </w:pPr>
+      <w:r>
+        <w:rPr>
+          <w:b w:val="false"/>
+          <w:bCs w:val="false"/>
+          <w:sz w:val="24"/>
+          <w:szCs w:val="24"/>
+        </w:rPr>
+      </w:r>
+    </w:p>
+    <w:p>
+      <w:pPr>
+        <w:pStyle w:val="Normal"/>
+        <w:bidi w:val="0"/>
+        <w:jc w:val="start"/>
+        <w:rPr>
+          <w:b/>
+          <w:bCs/>
+        </w:rPr>
+      </w:pPr>
+      <w:r>
+        <w:rPr>
+          <w:b/>
+          <w:bCs/>
+        </w:rPr>
+        <w:t>Organization Deletion</w:t>
+      </w:r>
+    </w:p>
+    <w:p>
+      <w:pPr>
+        <w:pStyle w:val="Normal"/>
+        <w:bidi w:val="0"/>
+        <w:jc w:val="start"/>
+        <w:rPr/>
+      </w:pPr>
+      <w:r>
+        <w:rPr/>
+        <w:t>When Organizations are deleted, the data data is retained for 2 weeks. During that period, it is possible to reactivate the Organization by contacting Hardscrabble. When the retention period is over, the Organization and all of its data will be physically and permanently deleted.</w:t>
+      </w:r>
+    </w:p>
+    <w:p>
+      <w:pPr>
+        <w:pStyle w:val="Normal"/>
+        <w:bidi w:val="0"/>
+        <w:jc w:val="start"/>
+        <w:rPr/>
+      </w:pPr>
+      <w:r>
+        <w:rPr/>
+      </w:r>
+    </w:p>
+    <w:p>
+      <w:pPr>
+        <w:pStyle w:val="Normal"/>
+        <w:bidi w:val="0"/>
+        <w:jc w:val="start"/>
+        <w:rPr>
+          <w:b/>
+          <w:bCs/>
+        </w:rPr>
+      </w:pPr>
+      <w:r>
+        <w:rPr>
+          <w:b/>
+          <w:bCs/>
+        </w:rPr>
+        <w:t>Batch Deletion</w:t>
+      </w:r>
+    </w:p>
+    <w:p>
+      <w:pPr>
+        <w:pStyle w:val="Normal"/>
+        <w:bidi w:val="0"/>
+        <w:jc w:val="start"/>
+        <w:rPr/>
+      </w:pPr>
+      <w:r>
+        <w:rPr/>
+        <w:t>When batches have been validated and uploaded to the customer, the batch is marked for deletion. The batch will be permanently deleted 14 days after it is marked for deletion.</w:t>
       </w:r>
     </w:p>
     <w:p>

</xml_diff>

<commit_message>
#79 - red Q when invoice is queued for ocr
</commit_message>
<xml_diff>
--- a/Documents/Hardscrabble Invoice.docx
+++ b/Documents/Hardscrabble Invoice.docx
@@ -225,7 +225,209 @@
           <w:sz w:val="24"/>
           <w:szCs w:val="24"/>
         </w:rPr>
-        <w:t>Batch: 100 invoices</w:t>
+        <w:t>User Limits:</w:t>
+      </w:r>
+    </w:p>
+    <w:p>
+      <w:pPr>
+        <w:pStyle w:val="Normal"/>
+        <w:bidi w:val="0"/>
+        <w:jc w:val="start"/>
+        <w:rPr>
+          <w:b w:val="false"/>
+          <w:bCs w:val="false"/>
+          <w:sz w:val="24"/>
+          <w:szCs w:val="24"/>
+        </w:rPr>
+      </w:pPr>
+      <w:r>
+        <w:rPr>
+          <w:b w:val="false"/>
+          <w:bCs w:val="false"/>
+          <w:sz w:val="24"/>
+          <w:szCs w:val="24"/>
+        </w:rPr>
+        <w:t>Batches: Unlimited</w:t>
+      </w:r>
+    </w:p>
+    <w:p>
+      <w:pPr>
+        <w:pStyle w:val="Normal"/>
+        <w:bidi w:val="0"/>
+        <w:jc w:val="start"/>
+        <w:rPr>
+          <w:b w:val="false"/>
+          <w:bCs w:val="false"/>
+          <w:sz w:val="24"/>
+          <w:szCs w:val="24"/>
+        </w:rPr>
+      </w:pPr>
+      <w:r>
+        <w:rPr>
+          <w:b w:val="false"/>
+          <w:bCs w:val="false"/>
+          <w:sz w:val="24"/>
+          <w:szCs w:val="24"/>
+        </w:rPr>
+        <w:t xml:space="preserve">Invoices per </w:t>
+      </w:r>
+      <w:r>
+        <w:rPr>
+          <w:b w:val="false"/>
+          <w:bCs w:val="false"/>
+          <w:sz w:val="24"/>
+          <w:szCs w:val="24"/>
+        </w:rPr>
+        <w:t xml:space="preserve">Batch: </w:t>
+      </w:r>
+      <w:r>
+        <w:rPr>
+          <w:b w:val="false"/>
+          <w:bCs w:val="false"/>
+          <w:sz w:val="24"/>
+          <w:szCs w:val="24"/>
+        </w:rPr>
+        <w:t>1</w:t>
+      </w:r>
+      <w:r>
+        <w:rPr>
+          <w:b w:val="false"/>
+          <w:bCs w:val="false"/>
+          <w:sz w:val="24"/>
+          <w:szCs w:val="24"/>
+        </w:rPr>
+        <w:t xml:space="preserve">00 </w:t>
+      </w:r>
+    </w:p>
+    <w:p>
+      <w:pPr>
+        <w:pStyle w:val="Normal"/>
+        <w:bidi w:val="0"/>
+        <w:jc w:val="start"/>
+        <w:rPr>
+          <w:b w:val="false"/>
+          <w:bCs w:val="false"/>
+          <w:sz w:val="24"/>
+          <w:szCs w:val="24"/>
+        </w:rPr>
+      </w:pPr>
+      <w:r>
+        <w:rPr>
+          <w:b w:val="false"/>
+          <w:bCs w:val="false"/>
+          <w:sz w:val="24"/>
+          <w:szCs w:val="24"/>
+        </w:rPr>
+        <w:t>Pages per Invoice: 20</w:t>
+      </w:r>
+    </w:p>
+    <w:p>
+      <w:pPr>
+        <w:pStyle w:val="Normal"/>
+        <w:bidi w:val="0"/>
+        <w:jc w:val="start"/>
+        <w:rPr>
+          <w:b w:val="false"/>
+          <w:bCs w:val="false"/>
+          <w:sz w:val="24"/>
+          <w:szCs w:val="24"/>
+        </w:rPr>
+      </w:pPr>
+      <w:r>
+        <w:rPr>
+          <w:b w:val="false"/>
+          <w:bCs w:val="false"/>
+          <w:sz w:val="24"/>
+          <w:szCs w:val="24"/>
+        </w:rPr>
+      </w:r>
+    </w:p>
+    <w:p>
+      <w:pPr>
+        <w:pStyle w:val="Normal"/>
+        <w:bidi w:val="0"/>
+        <w:jc w:val="start"/>
+        <w:rPr>
+          <w:b w:val="false"/>
+          <w:bCs w:val="false"/>
+          <w:sz w:val="24"/>
+          <w:szCs w:val="24"/>
+        </w:rPr>
+      </w:pPr>
+      <w:r>
+        <w:rPr>
+          <w:b w:val="false"/>
+          <w:bCs w:val="false"/>
+          <w:sz w:val="24"/>
+          <w:szCs w:val="24"/>
+        </w:rPr>
+        <w:t>Guest User Limits:</w:t>
+      </w:r>
+    </w:p>
+    <w:p>
+      <w:pPr>
+        <w:pStyle w:val="Normal"/>
+        <w:bidi w:val="0"/>
+        <w:jc w:val="start"/>
+        <w:rPr>
+          <w:b w:val="false"/>
+          <w:bCs w:val="false"/>
+          <w:sz w:val="24"/>
+          <w:szCs w:val="24"/>
+        </w:rPr>
+      </w:pPr>
+      <w:r>
+        <w:rPr>
+          <w:b w:val="false"/>
+          <w:bCs w:val="false"/>
+          <w:sz w:val="24"/>
+          <w:szCs w:val="24"/>
+        </w:rPr>
+        <w:t>Batches: 2</w:t>
+      </w:r>
+    </w:p>
+    <w:p>
+      <w:pPr>
+        <w:pStyle w:val="Normal"/>
+        <w:bidi w:val="0"/>
+        <w:jc w:val="start"/>
+        <w:rPr>
+          <w:b w:val="false"/>
+          <w:bCs w:val="false"/>
+          <w:sz w:val="24"/>
+          <w:szCs w:val="24"/>
+        </w:rPr>
+      </w:pPr>
+      <w:r>
+        <w:rPr>
+          <w:b w:val="false"/>
+          <w:bCs w:val="false"/>
+          <w:sz w:val="24"/>
+          <w:szCs w:val="24"/>
+        </w:rPr>
+        <w:t>Invoices per Batch: 20</w:t>
+      </w:r>
+    </w:p>
+    <w:p>
+      <w:pPr>
+        <w:pStyle w:val="Normal"/>
+        <w:bidi w:val="0"/>
+        <w:jc w:val="start"/>
+        <w:rPr>
+          <w:b w:val="false"/>
+          <w:bCs w:val="false"/>
+          <w:sz w:val="24"/>
+          <w:szCs w:val="24"/>
+        </w:rPr>
+      </w:pPr>
+      <w:r>
+        <w:rPr>
+          <w:b w:val="false"/>
+          <w:bCs w:val="false"/>
+          <w:sz w:val="24"/>
+          <w:szCs w:val="24"/>
+        </w:rPr>
+        <w:t>Pages Per Invoice: 20</w:t>
       </w:r>
     </w:p>
     <w:p>
@@ -573,25 +775,7 @@
           <w:sz w:val="24"/>
           <w:szCs w:val="24"/>
         </w:rPr>
-        <w:t xml:space="preserve">When both </w:t>
-      </w:r>
-      <w:r>
-        <w:rPr>
-          <w:b w:val="false"/>
-          <w:bCs w:val="false"/>
-          <w:sz w:val="24"/>
-          <w:szCs w:val="24"/>
-        </w:rPr>
-        <w:t xml:space="preserve">OCR </w:t>
-      </w:r>
-      <w:r>
-        <w:rPr>
-          <w:b w:val="false"/>
-          <w:bCs w:val="false"/>
-          <w:sz w:val="24"/>
-          <w:szCs w:val="24"/>
-        </w:rPr>
-        <w:t>process are done, the results are compared an analyzed for several types of errors:</w:t>
+        <w:t>When both OCR process are done, the results are compared an analyzed for several types of errors:</w:t>
       </w:r>
     </w:p>
     <w:p>
@@ -614,34 +798,7 @@
           <w:szCs w:val="24"/>
         </w:rPr>
         <w:tab/>
-        <w:t>1. A</w:t>
-      </w:r>
-      <w:r>
-        <w:rPr>
-          <w:b w:val="false"/>
-          <w:bCs w:val="false"/>
-          <w:sz w:val="24"/>
-          <w:szCs w:val="24"/>
-        </w:rPr>
-        <w:t>z</w:t>
-      </w:r>
-      <w:r>
-        <w:rPr>
-          <w:b w:val="false"/>
-          <w:bCs w:val="false"/>
-          <w:sz w:val="24"/>
-          <w:szCs w:val="24"/>
-        </w:rPr>
-        <w:t xml:space="preserve">ure Document Intelligence </w:t>
-      </w:r>
-      <w:r>
-        <w:rPr>
-          <w:b w:val="false"/>
-          <w:bCs w:val="false"/>
-          <w:sz w:val="24"/>
-          <w:szCs w:val="24"/>
-        </w:rPr>
-        <w:t>Field Confidence</w:t>
+        <w:t>1. Azure Document Intelligence Field Confidence</w:t>
       </w:r>
     </w:p>
     <w:p>
@@ -1347,6 +1504,7 @@
       <w:pgNumType w:fmt="decimal"/>
       <w:formProt w:val="false"/>
       <w:textDirection w:val="lrTb"/>
+      <w:docGrid w:type="default" w:linePitch="100" w:charSpace="0"/>
     </w:sectPr>
   </w:body>
 </w:document>
@@ -1366,7 +1524,6 @@
     </w:rPrDefault>
     <w:pPrDefault>
       <w:pPr>
-        <w:widowControl/>
         <w:suppressAutoHyphens w:val="true"/>
       </w:pPr>
     </w:pPrDefault>
@@ -1376,7 +1533,10 @@
     <w:qFormat/>
     <w:pPr>
       <w:widowControl/>
+      <w:suppressAutoHyphens w:val="true"/>
       <w:bidi w:val="0"/>
+      <w:spacing w:before="0" w:after="0"/>
+      <w:jc w:val="start"/>
     </w:pPr>
     <w:rPr>
       <w:rFonts w:ascii="Liberation Serif" w:hAnsi="Liberation Serif" w:eastAsia="NSimSun" w:cs="Lucida Sans"/>

</xml_diff>

<commit_message>
changed styles on org select dropdowns
</commit_message>
<xml_diff>
--- a/Documents/Hardscrabble Invoice.docx
+++ b/Documents/Hardscrabble Invoice.docx
@@ -269,34 +269,7 @@
           <w:sz w:val="24"/>
           <w:szCs w:val="24"/>
         </w:rPr>
-        <w:t xml:space="preserve">Invoices per </w:t>
-      </w:r>
-      <w:r>
-        <w:rPr>
-          <w:b w:val="false"/>
-          <w:bCs w:val="false"/>
-          <w:sz w:val="24"/>
-          <w:szCs w:val="24"/>
-        </w:rPr>
-        <w:t xml:space="preserve">Batch: </w:t>
-      </w:r>
-      <w:r>
-        <w:rPr>
-          <w:b w:val="false"/>
-          <w:bCs w:val="false"/>
-          <w:sz w:val="24"/>
-          <w:szCs w:val="24"/>
-        </w:rPr>
-        <w:t>1</w:t>
-      </w:r>
-      <w:r>
-        <w:rPr>
-          <w:b w:val="false"/>
-          <w:bCs w:val="false"/>
-          <w:sz w:val="24"/>
-          <w:szCs w:val="24"/>
-        </w:rPr>
-        <w:t xml:space="preserve">00 </w:t>
+        <w:t xml:space="preserve">Invoices per Batch: 100 </w:t>
       </w:r>
     </w:p>
     <w:p>
@@ -1440,19 +1413,85 @@
         <w:bidi w:val="0"/>
         <w:jc w:val="start"/>
         <w:rPr>
-          <w:b w:val="false"/>
-          <w:bCs w:val="false"/>
-          <w:sz w:val="24"/>
-          <w:szCs w:val="24"/>
-        </w:rPr>
-      </w:pPr>
-      <w:r>
-        <w:rPr>
-          <w:b w:val="false"/>
-          <w:bCs w:val="false"/>
-          <w:sz w:val="24"/>
-          <w:szCs w:val="24"/>
-        </w:rPr>
+          <w:b/>
+          <w:bCs/>
+          <w:sz w:val="24"/>
+          <w:szCs w:val="24"/>
+        </w:rPr>
+      </w:pPr>
+      <w:r>
+        <w:rPr>
+          <w:b/>
+          <w:bCs/>
+          <w:sz w:val="24"/>
+          <w:szCs w:val="24"/>
+        </w:rPr>
+        <w:t>User Management</w:t>
+      </w:r>
+    </w:p>
+    <w:p>
+      <w:pPr>
+        <w:pStyle w:val="Normal"/>
+        <w:bidi w:val="0"/>
+        <w:jc w:val="start"/>
+        <w:rPr>
+          <w:b w:val="false"/>
+          <w:bCs w:val="false"/>
+          <w:sz w:val="24"/>
+          <w:szCs w:val="24"/>
+        </w:rPr>
+      </w:pPr>
+      <w:r>
+        <w:rPr>
+          <w:b w:val="false"/>
+          <w:bCs w:val="false"/>
+          <w:sz w:val="24"/>
+          <w:szCs w:val="24"/>
+        </w:rPr>
+        <w:t>Deleting one org removes that org’s memberships; the user account stays as long as they have at least one remaining membership.</w:t>
+      </w:r>
+    </w:p>
+    <w:p>
+      <w:pPr>
+        <w:pStyle w:val="Normal"/>
+        <w:bidi w:val="0"/>
+        <w:jc w:val="start"/>
+        <w:rPr>
+          <w:b w:val="false"/>
+          <w:bCs w:val="false"/>
+          <w:sz w:val="24"/>
+          <w:szCs w:val="24"/>
+        </w:rPr>
+      </w:pPr>
+      <w:r>
+        <w:rPr>
+          <w:b w:val="false"/>
+          <w:bCs w:val="false"/>
+          <w:sz w:val="24"/>
+          <w:szCs w:val="24"/>
+        </w:rPr>
+      </w:r>
+    </w:p>
+    <w:p>
+      <w:pPr>
+        <w:pStyle w:val="Normal"/>
+        <w:bidi w:val="0"/>
+        <w:jc w:val="start"/>
+        <w:rPr>
+          <w:b w:val="false"/>
+          <w:bCs w:val="false"/>
+          <w:sz w:val="24"/>
+          <w:szCs w:val="24"/>
+        </w:rPr>
+      </w:pPr>
+      <w:r>
+        <w:rPr>
+          <w:b w:val="false"/>
+          <w:bCs w:val="false"/>
+          <w:sz w:val="24"/>
+          <w:szCs w:val="24"/>
+        </w:rPr>
+        <w:t>If the deleted org was their last org, then a non-global-admin user is deleted from Identity too, so yes — their registration is removed. Global admins are exempt and are kept even with no org memberships.</w:t>
       </w:r>
     </w:p>
     <w:p>

</xml_diff>